<commit_message>
updated to latest versions
</commit_message>
<xml_diff>
--- a/couchbase-mcp-comparison.docx
+++ b/couchbase-mcp-comparison.docx
@@ -44,7 +44,7 @@
           <w:sz w:val="20"/>
           <w:szCs w:val="20"/>
         </w:rPr>
-        <w:t>Surveyed: May 2026 · Method: empirical (cloned + enumerated) where possible, doc-based for the rest</w:t>
+        <w:t>Surveyed: June 2026 · Method: empirical (cloned + enumerated) where possible, doc-based for the rest</w:t>
       </w:r>
     </w:p>
     <w:p>
@@ -2092,7 +2092,7 @@
         <w:jc w:val="both"/>
       </w:pPr>
       <w:r>
-        <w:t>Six publicly available MCP servers expose Couchbase to LLM clients. They span four different runtimes (Python, Node.js, Java, plus a JDBC bridge), three orders of magnitude in tool count (1 to 164), and four different design philosophies (data plane only, full admin surface, JDBC pass-through, demo).</w:t>
+        <w:t>Six publicly available MCP servers expose Couchbase to LLM clients. They span four different runtimes (Python, Node.js, Java, plus a JDBC bridge), three orders of magnitude in tool count (1 to 167), and four different design philosophies (data plane only, full admin surface, JDBC pass-through, demo).</w:t>
       </w:r>
     </w:p>
     <w:p>
@@ -2101,7 +2101,7 @@
         <w:jc w:val="both"/>
       </w:pPr>
       <w:r>
-        <w:t>The two front-runners are the first-party Couchbase-Ecosystem/mcp-server-couchbase (22 tools, Apache 2.0, ships on PyPI and Docker, has a hosted docs site) and the celticht32/MCP-Couchbase fork (164 tools, hardened across seven phases with a bundled web GUI). The other four are limited in scope: Aniket's Node.js implementation covers basic CRUD and indexes (16 tools), Hummus is a single-tool SQL++ pass-through, Shivay's repositories are demonstration applications, and CData's server is a read-only JDBC bridge with three generic SQL tools.</w:t>
+        <w:t>The two front-runners are the first-party Couchbase-Ecosystem/mcp-server-couchbase (25 tools, Apache 2.0, ships on PyPI and Docker, has a hosted docs site, and has added an optional confirmation gate and OAuth scope enforcement) and the celticht32/MCP-Couchbase implementation (167 tools, an independent ground-up server that provides CRUD/data-plane parity with the official server and adds a full admin surface, hardened across seven phases with a bundled web GUI). The other four are limited in scope: Aniket's Node.js implementation covers basic CRUD and indexes (16 tools), Hummus is a single-tool SQL++ pass-through, Shivay's repositories are demonstration applications, and CData's server is a read-only JDBC bridge with three generic SQL tools.</w:t>
       </w:r>
     </w:p>
     <w:p>
@@ -2146,7 +2146,7 @@
         <w:jc w:val="both"/>
       </w:pPr>
       <w:r>
-        <w:t>Pick Couchbase-Ecosystem/mcp-server-couchbase. It is the only MCP server in this survey owned by Couchbase Inc., has CB_MCP_READ_ONLY_MODE=true as the default (so an LLM cannot accidentally delete data on first connection), implements MCP tool annotations correctly (readOnlyHint, destructiveHint, idempotentHint), and is the only one with a hosted docs site at mcp-server.couchbase.com. It ships on PyPI and Docker Hub, supports three transport modes (stdio / HTTP / SSE), and supports both basic and mTLS authentication. Trade-off: 22 tools means the cluster-admin surface is essentially absent — no buckets, scopes, users, XDCR, eventing, backup, encryption, or Capella v4 tooling. If you need any of those, you will be using the Couchbase REST API directly or another server.</w:t>
+        <w:t>Pick Couchbase-Ecosystem/mcp-server-couchbase. It is the only MCP server in this survey owned by Couchbase Inc., the only one with a hosted docs site at mcp-server.couchbase.com, the only one published to PyPI and Docker Hub, and the only one offering an SSE transport (it supports all three of stdio / HTTP / SSE). Like the celticht32 server it defaults to CB_MCP_READ_ONLY_MODE=true (so an LLM cannot accidentally delete data on first connection), carries per-tool MCP annotations (readOnlyHint, destructiveHint, idempotentHint), and supports both basic and mTLS authentication — none of those distinguish it from celticht32. What is genuinely first-party-only here is per-tool MCP scope enforcement (OAuth/JWT validated against a JWKS, honored on the HTTP transport), an opt-in per-tool confirmation gate (CB_MCP_CONFIRMATION_REQUIRED_TOOLS), and the support/roadmap backing of Couchbase itself. Trade-off: 25 tools means the cluster-admin surface is essentially absent — no buckets, scopes, users, XDCR, eventing, backup, encryption, or Capella v4 tooling. If you need any of those, you will be using the Couchbase REST API directly or another server.</w:t>
       </w:r>
     </w:p>
     <w:p>
@@ -2165,7 +2165,7 @@
         <w:jc w:val="both"/>
       </w:pPr>
       <w:r>
-        <w:t>Pick celticht32/MCP-Couchbase. It is a fork of the official server, hardened across seven phases, with 164 tools covering buckets, scopes, collections, users, groups, roles, audit, password policy, security settings, cluster operations (rebalance, failover, recovery, autofailover, autocompaction, logs, alerts, server-groups), XDCR (including 8.x conflict logging), indexes, vector indexes (Hyperscale and Composite for 8.x), FTS index management, synonyms, query performance analysis, eventing functions, backup repositories, encryption (DARE), KMIP key management, and Couchbase Capella v4 read-only control-plane inspection (organizations, projects, clusters, database users, allowed CIDRs, API keys, app services). It also bundles two web GUIs and 223 tests. Trade-off: not first-party, so support and feature roadmap are community-driven; READ_ONLY_MODE is opt-in rather than default-on (deliberate — operator tool).</w:t>
+        <w:t>Pick celticht32/MCP-Couchbase. It is an independent, ground-up Python server — not a git fork of the official one — that reaches CRUD/data-plane parity with the official server and models its safety defaults, then extends well past it, hardened across seven phases, with 167 tools covering buckets, scopes, collections, users, groups, roles, audit, password policy, security settings, cluster operations (rebalance, failover, recovery, autofailover, autocompaction, logs, alerts, server-groups), XDCR (including 8.x conflict logging), indexes, vector indexes (Hyperscale and Composite for 8.x), FTS index management, synonyms, query performance analysis, eventing functions, backup repositories, encryption (DARE), KMIP key management, and Couchbase Capella v4 read-only control-plane inspection (organizations, projects, clusters, database users, allowed CIDRs, API keys, app services). It also bundles two web GUIs (now with optional OIDC login and client-credentials M2M auth) and 274 tests. Trade-off: not first-party, so support and feature roadmap are community-driven. Like the official server it defaults to CB_MCP_READ_ONLY_MODE=true and binds its HTTP transport to localhost (CB_MCP_HOST=127.0.0.1); also like the official server's default configuration, the HTTP transport does not itself authenticate MCP requests — TLS termination and request authentication are delegated to a reverse proxy or trusted network, while the bundled GUI has its own OIDC login. (The official server additionally offers an opt-in built-in OAuth path; celticht32 leaves that to the deployment.)</w:t>
       </w:r>
     </w:p>
     <w:p>
@@ -2211,7 +2211,13 @@
         <w:pStyle w:val="Heading2"/>
       </w:pPr>
       <w:bookmarkStart w:id="6" w:name="_Toc230295303"/>
+    </w:p>
+    <w:p>
+      <w:pPr>
+        <w:pStyle w:val="Heading2"/>
+      </w:pPr>
       <w:r>
+        <w:lastRenderedPageBreak/>
         <w:t>You want minimal install or just SQL++ pass-through</w:t>
       </w:r>
       <w:bookmarkEnd w:id="6"/>
@@ -2229,19 +2235,8 @@
       <w:pPr>
         <w:pStyle w:val="Heading2"/>
       </w:pPr>
-    </w:p>
-    <w:p>
-      <w:pPr>
-        <w:pStyle w:val="Heading2"/>
-      </w:pPr>
-    </w:p>
-    <w:p>
-      <w:pPr>
-        <w:pStyle w:val="Heading2"/>
-      </w:pPr>
       <w:bookmarkStart w:id="7" w:name="_Toc230295304"/>
       <w:r>
-        <w:lastRenderedPageBreak/>
         <w:t>You are looking for a learning resource or demo</w:t>
       </w:r>
       <w:bookmarkEnd w:id="7"/>
@@ -2252,13 +2247,7 @@
         <w:jc w:val="both"/>
       </w:pPr>
       <w:r>
-        <w:t xml:space="preserve">Shivay-couchbase/couchbase-mcp contains two small demo applications (Star Wars planet semantic search and a </w:t>
-      </w:r>
-      <w:r>
-        <w:t>monster’s</w:t>
-      </w:r>
-      <w:r>
-        <w:t xml:space="preserve"> lookup) using vector search. Not intended for production but illustrative for vector search via MCP.</w:t>
+        <w:t>Shivay-couchbase/couchbase-mcp contains two small demo applications (Star Wars planet semantic search and a monster’s lookup) using vector search. Not intended for production but illustrative for vector search via MCP.</w:t>
       </w:r>
     </w:p>
     <w:p>
@@ -2330,12 +2319,6 @@
         <w:gridCol w:w="1329"/>
       </w:tblGrid>
       <w:tr>
-        <w:tblPrEx>
-          <w:tblCellMar>
-            <w:top w:w="0" w:type="dxa"/>
-            <w:bottom w:w="0" w:type="dxa"/>
-          </w:tblCellMar>
-        </w:tblPrEx>
         <w:trPr>
           <w:tblHeader/>
         </w:trPr>
@@ -2551,12 +2534,6 @@
         </w:tc>
       </w:tr>
       <w:tr>
-        <w:tblPrEx>
-          <w:tblCellMar>
-            <w:top w:w="0" w:type="dxa"/>
-            <w:bottom w:w="0" w:type="dxa"/>
-          </w:tblCellMar>
-        </w:tblPrEx>
         <w:tc>
           <w:tcPr>
             <w:tcW w:w="2400" w:type="dxa"/>
@@ -2634,7 +2611,7 @@
                 <w:sz w:val="16"/>
                 <w:szCs w:val="16"/>
               </w:rPr>
-              <w:t>Community (fork)</w:t>
+              <w:t>Community (independent)</w:t>
             </w:r>
           </w:p>
         </w:tc>
@@ -2744,12 +2721,6 @@
         </w:tc>
       </w:tr>
       <w:tr>
-        <w:tblPrEx>
-          <w:tblCellMar>
-            <w:top w:w="0" w:type="dxa"/>
-            <w:bottom w:w="0" w:type="dxa"/>
-          </w:tblCellMar>
-        </w:tblPrEx>
         <w:tc>
           <w:tcPr>
             <w:tcW w:w="2400" w:type="dxa"/>
@@ -2943,12 +2914,6 @@
         </w:tc>
       </w:tr>
       <w:tr>
-        <w:tblPrEx>
-          <w:tblCellMar>
-            <w:top w:w="0" w:type="dxa"/>
-            <w:bottom w:w="0" w:type="dxa"/>
-          </w:tblCellMar>
-        </w:tblPrEx>
         <w:tc>
           <w:tcPr>
             <w:tcW w:w="2400" w:type="dxa"/>
@@ -3136,12 +3101,6 @@
         </w:tc>
       </w:tr>
       <w:tr>
-        <w:tblPrEx>
-          <w:tblCellMar>
-            <w:top w:w="0" w:type="dxa"/>
-            <w:bottom w:w="0" w:type="dxa"/>
-          </w:tblCellMar>
-        </w:tblPrEx>
         <w:tc>
           <w:tcPr>
             <w:tcW w:w="2400" w:type="dxa"/>
@@ -3194,7 +3153,7 @@
                 <w:sz w:val="16"/>
                 <w:szCs w:val="16"/>
               </w:rPr>
-              <w:t>2026-04-21</w:t>
+              <w:t>2026-06-22</w:t>
             </w:r>
           </w:p>
         </w:tc>
@@ -3221,7 +3180,7 @@
                 <w:sz w:val="16"/>
                 <w:szCs w:val="16"/>
               </w:rPr>
-              <w:t>2026-05-21</w:t>
+              <w:t>2026-06-22</w:t>
             </w:r>
           </w:p>
         </w:tc>
@@ -3335,12 +3294,6 @@
         </w:tc>
       </w:tr>
       <w:tr>
-        <w:tblPrEx>
-          <w:tblCellMar>
-            <w:top w:w="0" w:type="dxa"/>
-            <w:bottom w:w="0" w:type="dxa"/>
-          </w:tblCellMar>
-        </w:tblPrEx>
         <w:tc>
           <w:tcPr>
             <w:tcW w:w="2400" w:type="dxa"/>
@@ -3418,7 +3371,7 @@
                 <w:sz w:val="16"/>
                 <w:szCs w:val="16"/>
               </w:rPr>
-              <w:t>Source only</w:t>
+              <w:t>Source + Dockerfile</w:t>
             </w:r>
           </w:p>
         </w:tc>
@@ -3528,12 +3481,6 @@
         </w:tc>
       </w:tr>
       <w:tr>
-        <w:tblPrEx>
-          <w:tblCellMar>
-            <w:top w:w="0" w:type="dxa"/>
-            <w:bottom w:w="0" w:type="dxa"/>
-          </w:tblCellMar>
-        </w:tblPrEx>
         <w:tc>
           <w:tcPr>
             <w:tcW w:w="2400" w:type="dxa"/>
@@ -3727,12 +3674,6 @@
         </w:tc>
       </w:tr>
       <w:tr>
-        <w:tblPrEx>
-          <w:tblCellMar>
-            <w:top w:w="0" w:type="dxa"/>
-            <w:bottom w:w="0" w:type="dxa"/>
-          </w:tblCellMar>
-        </w:tblPrEx>
         <w:tc>
           <w:tcPr>
             <w:tcW w:w="2400" w:type="dxa"/>
@@ -3920,12 +3861,6 @@
         </w:tc>
       </w:tr>
       <w:tr>
-        <w:tblPrEx>
-          <w:tblCellMar>
-            <w:top w:w="0" w:type="dxa"/>
-            <w:bottom w:w="0" w:type="dxa"/>
-          </w:tblCellMar>
-        </w:tblPrEx>
         <w:tc>
           <w:tcPr>
             <w:tcW w:w="2400" w:type="dxa"/>
@@ -3978,7 +3913,7 @@
                 <w:sz w:val="16"/>
                 <w:szCs w:val="16"/>
               </w:rPr>
-              <w:t>22</w:t>
+              <w:t>25</w:t>
             </w:r>
           </w:p>
         </w:tc>
@@ -4005,7 +3940,7 @@
                 <w:sz w:val="16"/>
                 <w:szCs w:val="16"/>
               </w:rPr>
-              <w:t>164</w:t>
+              <w:t>167</w:t>
             </w:r>
           </w:p>
         </w:tc>
@@ -4086,7 +4021,7 @@
                 <w:sz w:val="16"/>
                 <w:szCs w:val="16"/>
               </w:rPr>
-              <w:t>4 + 2 demos</w:t>
+              <w:t>6 (across 2 demo apps)</w:t>
             </w:r>
           </w:p>
         </w:tc>
@@ -4152,21 +4087,15 @@
         <w:tblLook w:val="04A0" w:firstRow="1" w:lastRow="0" w:firstColumn="1" w:lastColumn="0" w:noHBand="0" w:noVBand="1"/>
       </w:tblPr>
       <w:tblGrid>
-        <w:gridCol w:w="1520"/>
+        <w:gridCol w:w="1427"/>
+        <w:gridCol w:w="3863"/>
         <w:gridCol w:w="2601"/>
-        <w:gridCol w:w="2601"/>
-        <w:gridCol w:w="794"/>
-        <w:gridCol w:w="974"/>
-        <w:gridCol w:w="811"/>
-        <w:gridCol w:w="779"/>
+        <w:gridCol w:w="751"/>
+        <w:gridCol w:w="971"/>
+        <w:gridCol w:w="781"/>
+        <w:gridCol w:w="721"/>
       </w:tblGrid>
       <w:tr>
-        <w:tblPrEx>
-          <w:tblCellMar>
-            <w:top w:w="0" w:type="dxa"/>
-            <w:bottom w:w="0" w:type="dxa"/>
-          </w:tblCellMar>
-        </w:tblPrEx>
         <w:trPr>
           <w:tblHeader/>
         </w:trPr>
@@ -4382,12 +4311,6 @@
         </w:tc>
       </w:tr>
       <w:tr>
-        <w:tblPrEx>
-          <w:tblCellMar>
-            <w:top w:w="0" w:type="dxa"/>
-            <w:bottom w:w="0" w:type="dxa"/>
-          </w:tblCellMar>
-        </w:tblPrEx>
         <w:tc>
           <w:tcPr>
             <w:tcW w:w="2400" w:type="dxa"/>
@@ -4465,7 +4388,7 @@
                 <w:sz w:val="16"/>
                 <w:szCs w:val="16"/>
               </w:rPr>
-              <w:t>✓ opt-in (CB_MCP_READ_ONLY_MODE)</w:t>
+              <w:t>✓ default-on (CB_MCP_READ_ONLY_MODE)</w:t>
             </w:r>
           </w:p>
         </w:tc>
@@ -4575,12 +4498,6 @@
         </w:tc>
       </w:tr>
       <w:tr>
-        <w:tblPrEx>
-          <w:tblCellMar>
-            <w:top w:w="0" w:type="dxa"/>
-            <w:bottom w:w="0" w:type="dxa"/>
-          </w:tblCellMar>
-        </w:tblPrEx>
         <w:tc>
           <w:tcPr>
             <w:tcW w:w="2400" w:type="dxa"/>
@@ -4660,7 +4577,7 @@
                 <w:sz w:val="16"/>
                 <w:szCs w:val="16"/>
               </w:rPr>
-              <w:t>Partial — server-level not per-tool</w:t>
+              <w:t>✓ per-tool (all 167 tools)</w:t>
             </w:r>
           </w:p>
         </w:tc>
@@ -4774,12 +4691,6 @@
         </w:tc>
       </w:tr>
       <w:tr>
-        <w:tblPrEx>
-          <w:tblCellMar>
-            <w:top w:w="0" w:type="dxa"/>
-            <w:bottom w:w="0" w:type="dxa"/>
-          </w:tblCellMar>
-        </w:tblPrEx>
         <w:tc>
           <w:tcPr>
             <w:tcW w:w="2400" w:type="dxa"/>
@@ -4831,7 +4742,7 @@
                 <w:sz w:val="16"/>
                 <w:szCs w:val="16"/>
               </w:rPr>
-              <w:t>✗</w:t>
+              <w:t>✓ opt-in (CB_MCP_CONFIRMATION_REQUIRED_TOOLS)</w:t>
             </w:r>
           </w:p>
         </w:tc>
@@ -4962,6 +4873,193 @@
                 <w:szCs w:val="16"/>
               </w:rPr>
               <w:t>n/a</w:t>
+            </w:r>
+          </w:p>
+        </w:tc>
+      </w:tr>
+      <w:tr>
+        <w:tc>
+          <w:tcPr>
+            <w:tcW w:w="2400" w:type="dxa"/>
+            <w:tcBorders>
+              <w:top w:val="single" w:sz="1" w:space="0" w:color="CCCCCC"/>
+              <w:left w:val="single" w:sz="1" w:space="0" w:color="CCCCCC"/>
+              <w:bottom w:val="single" w:sz="1" w:space="0" w:color="CCCCCC"/>
+              <w:right w:val="single" w:sz="1" w:space="0" w:color="CCCCCC"/>
+            </w:tcBorders>
+            <w:shd w:val="clear" w:color="auto" w:fill="F0F4F8"/>
+            <w:tcMar>
+              <w:top w:w="60" w:type="dxa"/>
+              <w:left w:w="100" w:type="dxa"/>
+              <w:bottom w:w="60" w:type="dxa"/>
+              <w:right w:w="100" w:type="dxa"/>
+            </w:tcMar>
+          </w:tcPr>
+          <w:p>
+            <w:r>
+              <w:rPr>
+                <w:b/>
+                <w:bCs/>
+                <w:sz w:val="16"/>
+                <w:szCs w:val="16"/>
+              </w:rPr>
+              <w:t>OAuth / OIDC support</w:t>
+            </w:r>
+          </w:p>
+        </w:tc>
+        <w:tc>
+          <w:tcPr>
+            <w:tcW w:w="1200" w:type="dxa"/>
+            <w:tcBorders>
+              <w:top w:val="single" w:sz="1" w:space="0" w:color="CCCCCC"/>
+              <w:left w:val="single" w:sz="1" w:space="0" w:color="CCCCCC"/>
+              <w:bottom w:val="single" w:sz="1" w:space="0" w:color="CCCCCC"/>
+              <w:right w:val="single" w:sz="1" w:space="0" w:color="CCCCCC"/>
+            </w:tcBorders>
+            <w:tcMar>
+              <w:top w:w="60" w:type="dxa"/>
+              <w:left w:w="100" w:type="dxa"/>
+              <w:bottom w:w="60" w:type="dxa"/>
+              <w:right w:w="100" w:type="dxa"/>
+            </w:tcMar>
+          </w:tcPr>
+          <w:p>
+            <w:r>
+              <w:rPr>
+                <w:sz w:val="16"/>
+                <w:szCs w:val="16"/>
+              </w:rPr>
+              <w:t>✓ per-tool MCP scope enforcement (scope_enforcement.py)</w:t>
+            </w:r>
+          </w:p>
+        </w:tc>
+        <w:tc>
+          <w:tcPr>
+            <w:tcW w:w="1850" w:type="dxa"/>
+            <w:tcBorders>
+              <w:top w:val="single" w:sz="1" w:space="0" w:color="CCCCCC"/>
+              <w:left w:val="single" w:sz="1" w:space="0" w:color="CCCCCC"/>
+              <w:bottom w:val="single" w:sz="1" w:space="0" w:color="CCCCCC"/>
+              <w:right w:val="single" w:sz="1" w:space="0" w:color="CCCCCC"/>
+            </w:tcBorders>
+            <w:tcMar>
+              <w:top w:w="60" w:type="dxa"/>
+              <w:left w:w="100" w:type="dxa"/>
+              <w:bottom w:w="60" w:type="dxa"/>
+              <w:right w:w="100" w:type="dxa"/>
+            </w:tcMar>
+          </w:tcPr>
+          <w:p>
+            <w:r>
+              <w:rPr>
+                <w:sz w:val="16"/>
+                <w:szCs w:val="16"/>
+              </w:rPr>
+              <w:t>~ OIDC login on bundled GUI + client-credentials M2M; HTTP transport request-auth delegated to proxy/network (as in official default)</w:t>
+            </w:r>
+          </w:p>
+        </w:tc>
+        <w:tc>
+          <w:tcPr>
+            <w:tcW w:w="1200" w:type="dxa"/>
+            <w:tcBorders>
+              <w:top w:val="single" w:sz="1" w:space="0" w:color="CCCCCC"/>
+              <w:left w:val="single" w:sz="1" w:space="0" w:color="CCCCCC"/>
+              <w:bottom w:val="single" w:sz="1" w:space="0" w:color="CCCCCC"/>
+              <w:right w:val="single" w:sz="1" w:space="0" w:color="CCCCCC"/>
+            </w:tcBorders>
+            <w:tcMar>
+              <w:top w:w="60" w:type="dxa"/>
+              <w:left w:w="100" w:type="dxa"/>
+              <w:bottom w:w="60" w:type="dxa"/>
+              <w:right w:w="100" w:type="dxa"/>
+            </w:tcMar>
+          </w:tcPr>
+          <w:p>
+            <w:r>
+              <w:rPr>
+                <w:sz w:val="16"/>
+                <w:szCs w:val="16"/>
+              </w:rPr>
+              <w:t>✗</w:t>
+            </w:r>
+          </w:p>
+        </w:tc>
+        <w:tc>
+          <w:tcPr>
+            <w:tcW w:w="1000" w:type="dxa"/>
+            <w:tcBorders>
+              <w:top w:val="single" w:sz="1" w:space="0" w:color="CCCCCC"/>
+              <w:left w:val="single" w:sz="1" w:space="0" w:color="CCCCCC"/>
+              <w:bottom w:val="single" w:sz="1" w:space="0" w:color="CCCCCC"/>
+              <w:right w:val="single" w:sz="1" w:space="0" w:color="CCCCCC"/>
+            </w:tcBorders>
+            <w:tcMar>
+              <w:top w:w="60" w:type="dxa"/>
+              <w:left w:w="100" w:type="dxa"/>
+              <w:bottom w:w="60" w:type="dxa"/>
+              <w:right w:w="100" w:type="dxa"/>
+            </w:tcMar>
+          </w:tcPr>
+          <w:p>
+            <w:r>
+              <w:rPr>
+                <w:sz w:val="16"/>
+                <w:szCs w:val="16"/>
+              </w:rPr>
+              <w:t>✗</w:t>
+            </w:r>
+          </w:p>
+        </w:tc>
+        <w:tc>
+          <w:tcPr>
+            <w:tcW w:w="1100" w:type="dxa"/>
+            <w:tcBorders>
+              <w:top w:val="single" w:sz="1" w:space="0" w:color="CCCCCC"/>
+              <w:left w:val="single" w:sz="1" w:space="0" w:color="CCCCCC"/>
+              <w:bottom w:val="single" w:sz="1" w:space="0" w:color="CCCCCC"/>
+              <w:right w:val="single" w:sz="1" w:space="0" w:color="CCCCCC"/>
+            </w:tcBorders>
+            <w:tcMar>
+              <w:top w:w="60" w:type="dxa"/>
+              <w:left w:w="100" w:type="dxa"/>
+              <w:bottom w:w="60" w:type="dxa"/>
+              <w:right w:w="100" w:type="dxa"/>
+            </w:tcMar>
+          </w:tcPr>
+          <w:p>
+            <w:r>
+              <w:rPr>
+                <w:sz w:val="16"/>
+                <w:szCs w:val="16"/>
+              </w:rPr>
+              <w:t>✗</w:t>
+            </w:r>
+          </w:p>
+        </w:tc>
+        <w:tc>
+          <w:tcPr>
+            <w:tcW w:w="1330" w:type="dxa"/>
+            <w:tcBorders>
+              <w:top w:val="single" w:sz="1" w:space="0" w:color="CCCCCC"/>
+              <w:left w:val="single" w:sz="1" w:space="0" w:color="CCCCCC"/>
+              <w:bottom w:val="single" w:sz="1" w:space="0" w:color="CCCCCC"/>
+              <w:right w:val="single" w:sz="1" w:space="0" w:color="CCCCCC"/>
+            </w:tcBorders>
+            <w:tcMar>
+              <w:top w:w="60" w:type="dxa"/>
+              <w:left w:w="100" w:type="dxa"/>
+              <w:bottom w:w="60" w:type="dxa"/>
+              <w:right w:w="100" w:type="dxa"/>
+            </w:tcMar>
+          </w:tcPr>
+          <w:p>
+            <w:r>
+              <w:rPr>
+                <w:sz w:val="16"/>
+                <w:szCs w:val="16"/>
+              </w:rPr>
+              <w:t>✗</w:t>
             </w:r>
           </w:p>
         </w:tc>
@@ -5024,12 +5122,6 @@
         <w:gridCol w:w="2077"/>
       </w:tblGrid>
       <w:tr>
-        <w:tblPrEx>
-          <w:tblCellMar>
-            <w:top w:w="0" w:type="dxa"/>
-            <w:bottom w:w="0" w:type="dxa"/>
-          </w:tblCellMar>
-        </w:tblPrEx>
         <w:trPr>
           <w:tblHeader/>
         </w:trPr>
@@ -5245,12 +5337,6 @@
         </w:tc>
       </w:tr>
       <w:tr>
-        <w:tblPrEx>
-          <w:tblCellMar>
-            <w:top w:w="0" w:type="dxa"/>
-            <w:bottom w:w="0" w:type="dxa"/>
-          </w:tblCellMar>
-        </w:tblPrEx>
         <w:tc>
           <w:tcPr>
             <w:tcW w:w="2400" w:type="dxa"/>
@@ -5438,12 +5524,6 @@
         </w:tc>
       </w:tr>
       <w:tr>
-        <w:tblPrEx>
-          <w:tblCellMar>
-            <w:top w:w="0" w:type="dxa"/>
-            <w:bottom w:w="0" w:type="dxa"/>
-          </w:tblCellMar>
-        </w:tblPrEx>
         <w:tc>
           <w:tcPr>
             <w:tcW w:w="2400" w:type="dxa"/>
@@ -5637,12 +5717,6 @@
         </w:tc>
       </w:tr>
       <w:tr>
-        <w:tblPrEx>
-          <w:tblCellMar>
-            <w:top w:w="0" w:type="dxa"/>
-            <w:bottom w:w="0" w:type="dxa"/>
-          </w:tblCellMar>
-        </w:tblPrEx>
         <w:tc>
           <w:tcPr>
             <w:tcW w:w="2400" w:type="dxa"/>
@@ -5830,12 +5904,6 @@
         </w:tc>
       </w:tr>
       <w:tr>
-        <w:tblPrEx>
-          <w:tblCellMar>
-            <w:top w:w="0" w:type="dxa"/>
-            <w:bottom w:w="0" w:type="dxa"/>
-          </w:tblCellMar>
-        </w:tblPrEx>
         <w:tc>
           <w:tcPr>
             <w:tcW w:w="2400" w:type="dxa"/>
@@ -6029,12 +6097,6 @@
         </w:tc>
       </w:tr>
       <w:tr>
-        <w:tblPrEx>
-          <w:tblCellMar>
-            <w:top w:w="0" w:type="dxa"/>
-            <w:bottom w:w="0" w:type="dxa"/>
-          </w:tblCellMar>
-        </w:tblPrEx>
         <w:tc>
           <w:tcPr>
             <w:tcW w:w="2400" w:type="dxa"/>
@@ -6222,12 +6284,6 @@
         </w:tc>
       </w:tr>
       <w:tr>
-        <w:tblPrEx>
-          <w:tblCellMar>
-            <w:top w:w="0" w:type="dxa"/>
-            <w:bottom w:w="0" w:type="dxa"/>
-          </w:tblCellMar>
-        </w:tblPrEx>
         <w:tc>
           <w:tcPr>
             <w:tcW w:w="2400" w:type="dxa"/>
@@ -6421,12 +6477,6 @@
         </w:tc>
       </w:tr>
       <w:tr>
-        <w:tblPrEx>
-          <w:tblCellMar>
-            <w:top w:w="0" w:type="dxa"/>
-            <w:bottom w:w="0" w:type="dxa"/>
-          </w:tblCellMar>
-        </w:tblPrEx>
         <w:tc>
           <w:tcPr>
             <w:tcW w:w="2400" w:type="dxa"/>
@@ -6614,12 +6664,6 @@
         </w:tc>
       </w:tr>
       <w:tr>
-        <w:tblPrEx>
-          <w:tblCellMar>
-            <w:top w:w="0" w:type="dxa"/>
-            <w:bottom w:w="0" w:type="dxa"/>
-          </w:tblCellMar>
-        </w:tblPrEx>
         <w:tc>
           <w:tcPr>
             <w:tcW w:w="2400" w:type="dxa"/>
@@ -6813,12 +6857,6 @@
         </w:tc>
       </w:tr>
       <w:tr>
-        <w:tblPrEx>
-          <w:tblCellMar>
-            <w:top w:w="0" w:type="dxa"/>
-            <w:bottom w:w="0" w:type="dxa"/>
-          </w:tblCellMar>
-        </w:tblPrEx>
         <w:tc>
           <w:tcPr>
             <w:tcW w:w="2400" w:type="dxa"/>
@@ -7006,12 +7044,6 @@
         </w:tc>
       </w:tr>
       <w:tr>
-        <w:tblPrEx>
-          <w:tblCellMar>
-            <w:top w:w="0" w:type="dxa"/>
-            <w:bottom w:w="0" w:type="dxa"/>
-          </w:tblCellMar>
-        </w:tblPrEx>
         <w:tc>
           <w:tcPr>
             <w:tcW w:w="2400" w:type="dxa"/>
@@ -7205,12 +7237,6 @@
         </w:tc>
       </w:tr>
       <w:tr>
-        <w:tblPrEx>
-          <w:tblCellMar>
-            <w:top w:w="0" w:type="dxa"/>
-            <w:bottom w:w="0" w:type="dxa"/>
-          </w:tblCellMar>
-        </w:tblPrEx>
         <w:tc>
           <w:tcPr>
             <w:tcW w:w="2400" w:type="dxa"/>
@@ -7440,12 +7466,6 @@
         <w:gridCol w:w="1908"/>
       </w:tblGrid>
       <w:tr>
-        <w:tblPrEx>
-          <w:tblCellMar>
-            <w:top w:w="0" w:type="dxa"/>
-            <w:bottom w:w="0" w:type="dxa"/>
-          </w:tblCellMar>
-        </w:tblPrEx>
         <w:trPr>
           <w:tblHeader/>
         </w:trPr>
@@ -7661,12 +7681,6 @@
         </w:tc>
       </w:tr>
       <w:tr>
-        <w:tblPrEx>
-          <w:tblCellMar>
-            <w:top w:w="0" w:type="dxa"/>
-            <w:bottom w:w="0" w:type="dxa"/>
-          </w:tblCellMar>
-        </w:tblPrEx>
         <w:tc>
           <w:tcPr>
             <w:tcW w:w="2400" w:type="dxa"/>
@@ -7854,12 +7868,6 @@
         </w:tc>
       </w:tr>
       <w:tr>
-        <w:tblPrEx>
-          <w:tblCellMar>
-            <w:top w:w="0" w:type="dxa"/>
-            <w:bottom w:w="0" w:type="dxa"/>
-          </w:tblCellMar>
-        </w:tblPrEx>
         <w:tc>
           <w:tcPr>
             <w:tcW w:w="2400" w:type="dxa"/>
@@ -8053,12 +8061,6 @@
         </w:tc>
       </w:tr>
       <w:tr>
-        <w:tblPrEx>
-          <w:tblCellMar>
-            <w:top w:w="0" w:type="dxa"/>
-            <w:bottom w:w="0" w:type="dxa"/>
-          </w:tblCellMar>
-        </w:tblPrEx>
         <w:tc>
           <w:tcPr>
             <w:tcW w:w="2400" w:type="dxa"/>
@@ -8246,12 +8248,6 @@
         </w:tc>
       </w:tr>
       <w:tr>
-        <w:tblPrEx>
-          <w:tblCellMar>
-            <w:top w:w="0" w:type="dxa"/>
-            <w:bottom w:w="0" w:type="dxa"/>
-          </w:tblCellMar>
-        </w:tblPrEx>
         <w:tc>
           <w:tcPr>
             <w:tcW w:w="2400" w:type="dxa"/>
@@ -8502,12 +8498,6 @@
         <w:gridCol w:w="721"/>
       </w:tblGrid>
       <w:tr>
-        <w:tblPrEx>
-          <w:tblCellMar>
-            <w:top w:w="0" w:type="dxa"/>
-            <w:bottom w:w="0" w:type="dxa"/>
-          </w:tblCellMar>
-        </w:tblPrEx>
         <w:trPr>
           <w:tblHeader/>
         </w:trPr>
@@ -8723,12 +8713,6 @@
         </w:tc>
       </w:tr>
       <w:tr>
-        <w:tblPrEx>
-          <w:tblCellMar>
-            <w:top w:w="0" w:type="dxa"/>
-            <w:bottom w:w="0" w:type="dxa"/>
-          </w:tblCellMar>
-        </w:tblPrEx>
         <w:tc>
           <w:tcPr>
             <w:tcW w:w="2400" w:type="dxa"/>
@@ -8916,12 +8900,6 @@
         </w:tc>
       </w:tr>
       <w:tr>
-        <w:tblPrEx>
-          <w:tblCellMar>
-            <w:top w:w="0" w:type="dxa"/>
-            <w:bottom w:w="0" w:type="dxa"/>
-          </w:tblCellMar>
-        </w:tblPrEx>
         <w:tc>
           <w:tcPr>
             <w:tcW w:w="2400" w:type="dxa"/>
@@ -9115,12 +9093,6 @@
         </w:tc>
       </w:tr>
       <w:tr>
-        <w:tblPrEx>
-          <w:tblCellMar>
-            <w:top w:w="0" w:type="dxa"/>
-            <w:bottom w:w="0" w:type="dxa"/>
-          </w:tblCellMar>
-        </w:tblPrEx>
         <w:tc>
           <w:tcPr>
             <w:tcW w:w="2400" w:type="dxa"/>
@@ -9308,12 +9280,6 @@
         </w:tc>
       </w:tr>
       <w:tr>
-        <w:tblPrEx>
-          <w:tblCellMar>
-            <w:top w:w="0" w:type="dxa"/>
-            <w:bottom w:w="0" w:type="dxa"/>
-          </w:tblCellMar>
-        </w:tblPrEx>
         <w:tc>
           <w:tcPr>
             <w:tcW w:w="2400" w:type="dxa"/>
@@ -9393,7 +9359,7 @@
                 <w:sz w:val="16"/>
                 <w:szCs w:val="16"/>
               </w:rPr>
-              <w:t>✓ (admin_index_create_primary)</w:t>
+              <w:t>✓ (admin_index_create, is_primary=true)</w:t>
             </w:r>
           </w:p>
         </w:tc>
@@ -9507,12 +9473,6 @@
         </w:tc>
       </w:tr>
       <w:tr>
-        <w:tblPrEx>
-          <w:tblCellMar>
-            <w:top w:w="0" w:type="dxa"/>
-            <w:bottom w:w="0" w:type="dxa"/>
-          </w:tblCellMar>
-        </w:tblPrEx>
         <w:tc>
           <w:tcPr>
             <w:tcW w:w="2400" w:type="dxa"/>
@@ -9742,12 +9702,6 @@
         <w:gridCol w:w="1206"/>
       </w:tblGrid>
       <w:tr>
-        <w:tblPrEx>
-          <w:tblCellMar>
-            <w:top w:w="0" w:type="dxa"/>
-            <w:bottom w:w="0" w:type="dxa"/>
-          </w:tblCellMar>
-        </w:tblPrEx>
         <w:trPr>
           <w:tblHeader/>
         </w:trPr>
@@ -9963,12 +9917,6 @@
         </w:tc>
       </w:tr>
       <w:tr>
-        <w:tblPrEx>
-          <w:tblCellMar>
-            <w:top w:w="0" w:type="dxa"/>
-            <w:bottom w:w="0" w:type="dxa"/>
-          </w:tblCellMar>
-        </w:tblPrEx>
         <w:tc>
           <w:tcPr>
             <w:tcW w:w="2400" w:type="dxa"/>
@@ -10156,12 +10104,6 @@
         </w:tc>
       </w:tr>
       <w:tr>
-        <w:tblPrEx>
-          <w:tblCellMar>
-            <w:top w:w="0" w:type="dxa"/>
-            <w:bottom w:w="0" w:type="dxa"/>
-          </w:tblCellMar>
-        </w:tblPrEx>
         <w:tc>
           <w:tcPr>
             <w:tcW w:w="2400" w:type="dxa"/>
@@ -10355,12 +10297,6 @@
         </w:tc>
       </w:tr>
       <w:tr>
-        <w:tblPrEx>
-          <w:tblCellMar>
-            <w:top w:w="0" w:type="dxa"/>
-            <w:bottom w:w="0" w:type="dxa"/>
-          </w:tblCellMar>
-        </w:tblPrEx>
         <w:tc>
           <w:tcPr>
             <w:tcW w:w="2400" w:type="dxa"/>
@@ -10590,12 +10526,6 @@
         <w:gridCol w:w="1330"/>
       </w:tblGrid>
       <w:tr>
-        <w:tblPrEx>
-          <w:tblCellMar>
-            <w:top w:w="0" w:type="dxa"/>
-            <w:bottom w:w="0" w:type="dxa"/>
-          </w:tblCellMar>
-        </w:tblPrEx>
         <w:trPr>
           <w:tblHeader/>
         </w:trPr>
@@ -10811,12 +10741,6 @@
         </w:tc>
       </w:tr>
       <w:tr>
-        <w:tblPrEx>
-          <w:tblCellMar>
-            <w:top w:w="0" w:type="dxa"/>
-            <w:bottom w:w="0" w:type="dxa"/>
-          </w:tblCellMar>
-        </w:tblPrEx>
         <w:tc>
           <w:tcPr>
             <w:tcW w:w="2400" w:type="dxa"/>
@@ -11004,12 +10928,6 @@
         </w:tc>
       </w:tr>
       <w:tr>
-        <w:tblPrEx>
-          <w:tblCellMar>
-            <w:top w:w="0" w:type="dxa"/>
-            <w:bottom w:w="0" w:type="dxa"/>
-          </w:tblCellMar>
-        </w:tblPrEx>
         <w:tc>
           <w:tcPr>
             <w:tcW w:w="2400" w:type="dxa"/>
@@ -11203,12 +11121,6 @@
         </w:tc>
       </w:tr>
       <w:tr>
-        <w:tblPrEx>
-          <w:tblCellMar>
-            <w:top w:w="0" w:type="dxa"/>
-            <w:bottom w:w="0" w:type="dxa"/>
-          </w:tblCellMar>
-        </w:tblPrEx>
         <w:tc>
           <w:tcPr>
             <w:tcW w:w="2400" w:type="dxa"/>
@@ -11396,12 +11308,6 @@
         </w:tc>
       </w:tr>
       <w:tr>
-        <w:tblPrEx>
-          <w:tblCellMar>
-            <w:top w:w="0" w:type="dxa"/>
-            <w:bottom w:w="0" w:type="dxa"/>
-          </w:tblCellMar>
-        </w:tblPrEx>
         <w:tc>
           <w:tcPr>
             <w:tcW w:w="2400" w:type="dxa"/>
@@ -11652,12 +11558,6 @@
         <w:gridCol w:w="1284"/>
       </w:tblGrid>
       <w:tr>
-        <w:tblPrEx>
-          <w:tblCellMar>
-            <w:top w:w="0" w:type="dxa"/>
-            <w:bottom w:w="0" w:type="dxa"/>
-          </w:tblCellMar>
-        </w:tblPrEx>
         <w:trPr>
           <w:tblHeader/>
         </w:trPr>
@@ -11873,12 +11773,6 @@
         </w:tc>
       </w:tr>
       <w:tr>
-        <w:tblPrEx>
-          <w:tblCellMar>
-            <w:top w:w="0" w:type="dxa"/>
-            <w:bottom w:w="0" w:type="dxa"/>
-          </w:tblCellMar>
-        </w:tblPrEx>
         <w:tc>
           <w:tcPr>
             <w:tcW w:w="2400" w:type="dxa"/>
@@ -12066,12 +11960,6 @@
         </w:tc>
       </w:tr>
       <w:tr>
-        <w:tblPrEx>
-          <w:tblCellMar>
-            <w:top w:w="0" w:type="dxa"/>
-            <w:bottom w:w="0" w:type="dxa"/>
-          </w:tblCellMar>
-        </w:tblPrEx>
         <w:tc>
           <w:tcPr>
             <w:tcW w:w="2400" w:type="dxa"/>
@@ -12265,12 +12153,6 @@
         </w:tc>
       </w:tr>
       <w:tr>
-        <w:tblPrEx>
-          <w:tblCellMar>
-            <w:top w:w="0" w:type="dxa"/>
-            <w:bottom w:w="0" w:type="dxa"/>
-          </w:tblCellMar>
-        </w:tblPrEx>
         <w:tc>
           <w:tcPr>
             <w:tcW w:w="2400" w:type="dxa"/>
@@ -12500,12 +12382,6 @@
         <w:gridCol w:w="1201"/>
       </w:tblGrid>
       <w:tr>
-        <w:tblPrEx>
-          <w:tblCellMar>
-            <w:top w:w="0" w:type="dxa"/>
-            <w:bottom w:w="0" w:type="dxa"/>
-          </w:tblCellMar>
-        </w:tblPrEx>
         <w:trPr>
           <w:tblHeader/>
         </w:trPr>
@@ -12721,12 +12597,6 @@
         </w:tc>
       </w:tr>
       <w:tr>
-        <w:tblPrEx>
-          <w:tblCellMar>
-            <w:top w:w="0" w:type="dxa"/>
-            <w:bottom w:w="0" w:type="dxa"/>
-          </w:tblCellMar>
-        </w:tblPrEx>
         <w:tc>
           <w:tcPr>
             <w:tcW w:w="2400" w:type="dxa"/>
@@ -12914,12 +12784,6 @@
         </w:tc>
       </w:tr>
       <w:tr>
-        <w:tblPrEx>
-          <w:tblCellMar>
-            <w:top w:w="0" w:type="dxa"/>
-            <w:bottom w:w="0" w:type="dxa"/>
-          </w:tblCellMar>
-        </w:tblPrEx>
         <w:tc>
           <w:tcPr>
             <w:tcW w:w="2400" w:type="dxa"/>
@@ -13155,12 +13019,6 @@
         <w:gridCol w:w="1311"/>
       </w:tblGrid>
       <w:tr>
-        <w:tblPrEx>
-          <w:tblCellMar>
-            <w:top w:w="0" w:type="dxa"/>
-            <w:bottom w:w="0" w:type="dxa"/>
-          </w:tblCellMar>
-        </w:tblPrEx>
         <w:trPr>
           <w:tblHeader/>
         </w:trPr>
@@ -13376,12 +13234,6 @@
         </w:tc>
       </w:tr>
       <w:tr>
-        <w:tblPrEx>
-          <w:tblCellMar>
-            <w:top w:w="0" w:type="dxa"/>
-            <w:bottom w:w="0" w:type="dxa"/>
-          </w:tblCellMar>
-        </w:tblPrEx>
         <w:tc>
           <w:tcPr>
             <w:tcW w:w="2400" w:type="dxa"/>
@@ -13569,12 +13421,6 @@
         </w:tc>
       </w:tr>
       <w:tr>
-        <w:tblPrEx>
-          <w:tblCellMar>
-            <w:top w:w="0" w:type="dxa"/>
-            <w:bottom w:w="0" w:type="dxa"/>
-          </w:tblCellMar>
-        </w:tblPrEx>
         <w:tc>
           <w:tcPr>
             <w:tcW w:w="2400" w:type="dxa"/>
@@ -13768,12 +13614,6 @@
         </w:tc>
       </w:tr>
       <w:tr>
-        <w:tblPrEx>
-          <w:tblCellMar>
-            <w:top w:w="0" w:type="dxa"/>
-            <w:bottom w:w="0" w:type="dxa"/>
-          </w:tblCellMar>
-        </w:tblPrEx>
         <w:tc>
           <w:tcPr>
             <w:tcW w:w="2400" w:type="dxa"/>
@@ -14003,12 +13843,6 @@
         <w:gridCol w:w="1016"/>
       </w:tblGrid>
       <w:tr>
-        <w:tblPrEx>
-          <w:tblCellMar>
-            <w:top w:w="0" w:type="dxa"/>
-            <w:bottom w:w="0" w:type="dxa"/>
-          </w:tblCellMar>
-        </w:tblPrEx>
         <w:trPr>
           <w:tblHeader/>
         </w:trPr>
@@ -14224,12 +14058,6 @@
         </w:tc>
       </w:tr>
       <w:tr>
-        <w:tblPrEx>
-          <w:tblCellMar>
-            <w:top w:w="0" w:type="dxa"/>
-            <w:bottom w:w="0" w:type="dxa"/>
-          </w:tblCellMar>
-        </w:tblPrEx>
         <w:tc>
           <w:tcPr>
             <w:tcW w:w="2400" w:type="dxa"/>
@@ -14417,12 +14245,6 @@
         </w:tc>
       </w:tr>
       <w:tr>
-        <w:tblPrEx>
-          <w:tblCellMar>
-            <w:top w:w="0" w:type="dxa"/>
-            <w:bottom w:w="0" w:type="dxa"/>
-          </w:tblCellMar>
-        </w:tblPrEx>
         <w:tc>
           <w:tcPr>
             <w:tcW w:w="2400" w:type="dxa"/>
@@ -14616,12 +14438,6 @@
         </w:tc>
       </w:tr>
       <w:tr>
-        <w:tblPrEx>
-          <w:tblCellMar>
-            <w:top w:w="0" w:type="dxa"/>
-            <w:bottom w:w="0" w:type="dxa"/>
-          </w:tblCellMar>
-        </w:tblPrEx>
         <w:tc>
           <w:tcPr>
             <w:tcW w:w="2400" w:type="dxa"/>
@@ -14809,12 +14625,6 @@
         </w:tc>
       </w:tr>
       <w:tr>
-        <w:tblPrEx>
-          <w:tblCellMar>
-            <w:top w:w="0" w:type="dxa"/>
-            <w:bottom w:w="0" w:type="dxa"/>
-          </w:tblCellMar>
-        </w:tblPrEx>
         <w:tc>
           <w:tcPr>
             <w:tcW w:w="2400" w:type="dxa"/>
@@ -15008,12 +14818,6 @@
         </w:tc>
       </w:tr>
       <w:tr>
-        <w:tblPrEx>
-          <w:tblCellMar>
-            <w:top w:w="0" w:type="dxa"/>
-            <w:bottom w:w="0" w:type="dxa"/>
-          </w:tblCellMar>
-        </w:tblPrEx>
         <w:tc>
           <w:tcPr>
             <w:tcW w:w="2400" w:type="dxa"/>
@@ -15249,21 +15053,15 @@
         <w:tblLook w:val="04A0" w:firstRow="1" w:lastRow="0" w:firstColumn="1" w:lastColumn="0" w:noHBand="0" w:noVBand="1"/>
       </w:tblPr>
       <w:tblGrid>
-        <w:gridCol w:w="2383"/>
-        <w:gridCol w:w="1195"/>
-        <w:gridCol w:w="1890"/>
-        <w:gridCol w:w="1194"/>
-        <w:gridCol w:w="1000"/>
-        <w:gridCol w:w="1096"/>
-        <w:gridCol w:w="1322"/>
+        <w:gridCol w:w="2258"/>
+        <w:gridCol w:w="1154"/>
+        <w:gridCol w:w="2202"/>
+        <w:gridCol w:w="1147"/>
+        <w:gridCol w:w="997"/>
+        <w:gridCol w:w="1063"/>
+        <w:gridCol w:w="1259"/>
       </w:tblGrid>
       <w:tr>
-        <w:tblPrEx>
-          <w:tblCellMar>
-            <w:top w:w="0" w:type="dxa"/>
-            <w:bottom w:w="0" w:type="dxa"/>
-          </w:tblCellMar>
-        </w:tblPrEx>
         <w:trPr>
           <w:tblHeader/>
         </w:trPr>
@@ -15479,12 +15277,6 @@
         </w:tc>
       </w:tr>
       <w:tr>
-        <w:tblPrEx>
-          <w:tblCellMar>
-            <w:top w:w="0" w:type="dxa"/>
-            <w:bottom w:w="0" w:type="dxa"/>
-          </w:tblCellMar>
-        </w:tblPrEx>
         <w:tc>
           <w:tcPr>
             <w:tcW w:w="2400" w:type="dxa"/>
@@ -15672,12 +15464,6 @@
         </w:tc>
       </w:tr>
       <w:tr>
-        <w:tblPrEx>
-          <w:tblCellMar>
-            <w:top w:w="0" w:type="dxa"/>
-            <w:bottom w:w="0" w:type="dxa"/>
-          </w:tblCellMar>
-        </w:tblPrEx>
         <w:tc>
           <w:tcPr>
             <w:tcW w:w="2400" w:type="dxa"/>
@@ -15871,12 +15657,6 @@
         </w:tc>
       </w:tr>
       <w:tr>
-        <w:tblPrEx>
-          <w:tblCellMar>
-            <w:top w:w="0" w:type="dxa"/>
-            <w:bottom w:w="0" w:type="dxa"/>
-          </w:tblCellMar>
-        </w:tblPrEx>
         <w:tc>
           <w:tcPr>
             <w:tcW w:w="2400" w:type="dxa"/>
@@ -16064,12 +15844,6 @@
         </w:tc>
       </w:tr>
       <w:tr>
-        <w:tblPrEx>
-          <w:tblCellMar>
-            <w:top w:w="0" w:type="dxa"/>
-            <w:bottom w:w="0" w:type="dxa"/>
-          </w:tblCellMar>
-        </w:tblPrEx>
         <w:tc>
           <w:tcPr>
             <w:tcW w:w="2400" w:type="dxa"/>
@@ -16263,12 +16037,6 @@
         </w:tc>
       </w:tr>
       <w:tr>
-        <w:tblPrEx>
-          <w:tblCellMar>
-            <w:top w:w="0" w:type="dxa"/>
-            <w:bottom w:w="0" w:type="dxa"/>
-          </w:tblCellMar>
-        </w:tblPrEx>
         <w:tc>
           <w:tcPr>
             <w:tcW w:w="2400" w:type="dxa"/>
@@ -16346,7 +16114,7 @@
                 <w:sz w:val="16"/>
                 <w:szCs w:val="16"/>
               </w:rPr>
-              <w:t>✓ (admin_system_events, admin_prometheus)</w:t>
+              <w:t>✓ (admin_system_events, admin_prometheus_targets)</w:t>
             </w:r>
           </w:p>
         </w:tc>
@@ -16498,12 +16266,6 @@
         <w:gridCol w:w="1272"/>
       </w:tblGrid>
       <w:tr>
-        <w:tblPrEx>
-          <w:tblCellMar>
-            <w:top w:w="0" w:type="dxa"/>
-            <w:bottom w:w="0" w:type="dxa"/>
-          </w:tblCellMar>
-        </w:tblPrEx>
         <w:trPr>
           <w:tblHeader/>
         </w:trPr>
@@ -16719,12 +16481,6 @@
         </w:tc>
       </w:tr>
       <w:tr>
-        <w:tblPrEx>
-          <w:tblCellMar>
-            <w:top w:w="0" w:type="dxa"/>
-            <w:bottom w:w="0" w:type="dxa"/>
-          </w:tblCellMar>
-        </w:tblPrEx>
         <w:tc>
           <w:tcPr>
             <w:tcW w:w="2400" w:type="dxa"/>
@@ -16912,12 +16668,6 @@
         </w:tc>
       </w:tr>
       <w:tr>
-        <w:tblPrEx>
-          <w:tblCellMar>
-            <w:top w:w="0" w:type="dxa"/>
-            <w:bottom w:w="0" w:type="dxa"/>
-          </w:tblCellMar>
-        </w:tblPrEx>
         <w:tc>
           <w:tcPr>
             <w:tcW w:w="2400" w:type="dxa"/>
@@ -17111,12 +16861,6 @@
         </w:tc>
       </w:tr>
       <w:tr>
-        <w:tblPrEx>
-          <w:tblCellMar>
-            <w:top w:w="0" w:type="dxa"/>
-            <w:bottom w:w="0" w:type="dxa"/>
-          </w:tblCellMar>
-        </w:tblPrEx>
         <w:tc>
           <w:tcPr>
             <w:tcW w:w="2400" w:type="dxa"/>
@@ -17304,12 +17048,6 @@
         </w:tc>
       </w:tr>
       <w:tr>
-        <w:tblPrEx>
-          <w:tblCellMar>
-            <w:top w:w="0" w:type="dxa"/>
-            <w:bottom w:w="0" w:type="dxa"/>
-          </w:tblCellMar>
-        </w:tblPrEx>
         <w:tc>
           <w:tcPr>
             <w:tcW w:w="2400" w:type="dxa"/>
@@ -17545,12 +17283,6 @@
         <w:gridCol w:w="1218"/>
       </w:tblGrid>
       <w:tr>
-        <w:tblPrEx>
-          <w:tblCellMar>
-            <w:top w:w="0" w:type="dxa"/>
-            <w:bottom w:w="0" w:type="dxa"/>
-          </w:tblCellMar>
-        </w:tblPrEx>
         <w:trPr>
           <w:tblHeader/>
         </w:trPr>
@@ -17766,12 +17498,6 @@
         </w:tc>
       </w:tr>
       <w:tr>
-        <w:tblPrEx>
-          <w:tblCellMar>
-            <w:top w:w="0" w:type="dxa"/>
-            <w:bottom w:w="0" w:type="dxa"/>
-          </w:tblCellMar>
-        </w:tblPrEx>
         <w:tc>
           <w:tcPr>
             <w:tcW w:w="2400" w:type="dxa"/>
@@ -17959,12 +17685,6 @@
         </w:tc>
       </w:tr>
       <w:tr>
-        <w:tblPrEx>
-          <w:tblCellMar>
-            <w:top w:w="0" w:type="dxa"/>
-            <w:bottom w:w="0" w:type="dxa"/>
-          </w:tblCellMar>
-        </w:tblPrEx>
         <w:tc>
           <w:tcPr>
             <w:tcW w:w="2400" w:type="dxa"/>
@@ -18044,7 +17764,7 @@
                 <w:sz w:val="16"/>
                 <w:szCs w:val="16"/>
               </w:rPr>
-              <w:t>✓ (223 tests, pytest)</w:t>
+              <w:t>✓ (274 tests, pytest)</w:t>
             </w:r>
           </w:p>
         </w:tc>
@@ -18158,12 +17878,6 @@
         </w:tc>
       </w:tr>
       <w:tr>
-        <w:tblPrEx>
-          <w:tblCellMar>
-            <w:top w:w="0" w:type="dxa"/>
-            <w:bottom w:w="0" w:type="dxa"/>
-          </w:tblCellMar>
-        </w:tblPrEx>
         <w:tc>
           <w:tcPr>
             <w:tcW w:w="2400" w:type="dxa"/>
@@ -18426,7 +18140,7 @@
         <w:jc w:val="both"/>
       </w:pPr>
       <w:r>
-        <w:t>The celticht32 fork was originally based on the official mcp-server-couchbase but renamed most tools to a cb_* / admin_* convention during the Phase 1-3 hardening. The same capability appears under different names — for example, the official server's get_document_by_id becomes cb_get in celticht32, and run_sql_plus_plus_query becomes cb_query. The matrix shows both names where this applies so the equivalence is visible.</w:t>
+        <w:t>celticht32 is an independent implementation rather than a git fork of the official mcp-server-couchbase, and it uses its own cb_* / admin_* naming convention. Where the two servers cover the same capability the names differ — for example, the official server's get_document_by_id is the parity equivalent of celticht32's cb_get, and run_sql_plus_plus_query corresponds to cb_query. The matrix shows both names where this applies so the equivalence is visible.</w:t>
       </w:r>
     </w:p>
     <w:p>
@@ -18445,7 +18159,7 @@
         <w:jc w:val="both"/>
       </w:pPr>
       <w:r>
-        <w:t>A generic vector MCP server (kennyfromfunk/vector-mcp-server) lists Couchbase as one of five supported vector stores alongside ChromaDB, MongoDB, Qdrant, and PGVector. It was excluded because it is not Couchbase-specific — its tool surface treats every backend the same way. Any future Couchbase-specific MCP servers published after May 2026 are by definition out of scope.</w:t>
+        <w:t>A generic vector MCP server (kennyfromfunk/vector-mcp-server) lists Couchbase as one of five supported vector stores alongside ChromaDB, MongoDB, Qdrant, and PGVector. It was excluded because it is not Couchbase-specific — its tool surface treats every backend the same way. Any future Couchbase-specific MCP servers published after June 2026 are by definition out of scope.</w:t>
       </w:r>
     </w:p>
     <w:p>
@@ -18487,7 +18201,7 @@
         </w:numPr>
       </w:pPr>
       <w:r>
-        <w:t>Need first-party support and safety defaults? → Couchbase-Ecosystem/mcp-server-couchbase</w:t>
+        <w:t>Need first-party support and a Couchbase-backed roadmap? → Couchbase-Ecosystem/mcp-server-couchbase</w:t>
       </w:r>
     </w:p>
     <w:p>
@@ -18568,7 +18282,7 @@
         <w:spacing w:after="120"/>
       </w:pPr>
       <w:r>
-        <w:t>Even the most complete server (celticht32 at 164 tools) has gaps. Across all six:</w:t>
+        <w:t>Even the most complete server (celticht32 at 167 tools) has gaps. Across all six:</w:t>
       </w:r>
     </w:p>
     <w:p>
@@ -18604,7 +18318,7 @@
         </w:numPr>
       </w:pPr>
       <w:r>
-        <w:t>Cross-Datacenter Replication (XDCR) is covered only by celticht32 (11 tools). The official has zero XDCR coverage.</w:t>
+        <w:t>Cross-Datacenter Replication (XDCR) is covered only by celticht32 (10 tools, plus the 8.x conflict-log readback). The official has zero XDCR coverage.</w:t>
       </w:r>
     </w:p>
     <w:p>
@@ -18678,7 +18392,7 @@
         <w:jc w:val="both"/>
       </w:pPr>
       <w:r>
-        <w:t>The official server has the safety controls; celticht32 has the surface area. If you need both, run celticht32 with CB_MCP_READ_ONLY_MODE=true at MCP boot. That gives you celticht32's 164 tools filtered to the read-side, which lands very close to the official server's default-safe posture but with deeper read-side admin coverage (rebalance status, XDCR replication state, eventing function status, Capella organization listings, etc.).</w:t>
+        <w:t>Both servers ship a default-safe posture — CB_MCP_READ_ONLY_MODE=true by default and per-tool read/destructive annotations — so the real axis is surface area and ownership, not safety. celticht32 adds the larger admin surface (167 tools) plus a confirmation gate on destructive operations; the official server adds first-party support and per-tool MCP scope enforcement. If you want the admin breadth while staying read-only, run celticht32 with CB_MCP_READ_ONLY_MODE=true (its default) at MCP boot. That filters its 167 tools to the read-side, giving you deeper read-side admin coverage than the official server (rebalance status, XDCR replication state, eventing function status, Capella organization listings, etc.) at the same default-safe posture.</w:t>
       </w:r>
     </w:p>
     <w:sectPr>

</xml_diff>